<commit_message>
Fo & To afgerond
ben klaar met Laravel denk ik
</commit_message>
<xml_diff>
--- a/Functioneel Ontwerp.docx
+++ b/Functioneel Ontwerp.docx
@@ -3,6 +3,1161 @@
 <w:document xmlns:wpc="http://schemas.microsoft.com/office/word/2010/wordprocessingCanvas" xmlns:cx="http://schemas.microsoft.com/office/drawing/2014/chartex" xmlns:cx1="http://schemas.microsoft.com/office/drawing/2015/9/8/chartex" xmlns:cx2="http://schemas.microsoft.com/office/drawing/2015/10/21/chartex" xmlns:cx3="http://schemas.microsoft.com/office/drawing/2016/5/9/chartex" xmlns:cx4="http://schemas.microsoft.com/office/drawing/2016/5/10/chartex" xmlns:cx5="http://schemas.microsoft.com/office/drawing/2016/5/11/chartex" xmlns:cx6="http://schemas.microsoft.com/office/drawing/2016/5/12/chartex" xmlns:cx7="http://schemas.microsoft.com/office/drawing/2016/5/13/chartex" xmlns:cx8="http://schemas.microsoft.com/office/drawing/2016/5/14/chartex" xmlns:mc="http://schemas.openxmlformats.org/markup-compatibility/2006" xmlns:aink="http://schemas.microsoft.com/office/drawing/2016/ink" xmlns:am3d="http://schemas.microsoft.com/office/drawing/2017/model3d" xmlns:o="urn:schemas-microsoft-com:office:office" xmlns:oel="http://schemas.microsoft.com/office/2019/extlst" xmlns:r="http://schemas.openxmlformats.org/officeDocument/2006/relationships" xmlns:m="http://schemas.openxmlformats.org/officeDocument/2006/math" xmlns:v="urn:schemas-microsoft-com:vml" xmlns:wp14="http://schemas.microsoft.com/office/word/2010/wordprocessingDrawing" xmlns:wp="http://schemas.openxmlformats.org/drawingml/2006/wordprocessingDrawing" xmlns:w10="urn:schemas-microsoft-com:office:word" xmlns:w="http://schemas.openxmlformats.org/wordprocessingml/2006/main" xmlns:w14="http://schemas.microsoft.com/office/word/2010/wordml" xmlns:w15="http://schemas.microsoft.com/office/word/2012/wordml" xmlns:w16cex="http://schemas.microsoft.com/office/word/2018/wordml/cex" xmlns:w16cid="http://schemas.microsoft.com/office/word/2016/wordml/cid" xmlns:w16="http://schemas.microsoft.com/office/word/2018/wordml" xmlns:w16du="http://schemas.microsoft.com/office/word/2023/wordml/word16du" xmlns:w16sdtdh="http://schemas.microsoft.com/office/word/2020/wordml/sdtdatahash" xmlns:w16sdtfl="http://schemas.microsoft.com/office/word/2024/wordml/sdtformatlock" xmlns:w16se="http://schemas.microsoft.com/office/word/2015/wordml/symex" xmlns:wpg="http://schemas.microsoft.com/office/word/2010/wordprocessingGroup" xmlns:wpi="http://schemas.microsoft.com/office/word/2010/wordprocessingInk" xmlns:wne="http://schemas.microsoft.com/office/word/2006/wordml" xmlns:wps="http://schemas.microsoft.com/office/word/2010/wordprocessingShape" mc:Ignorable="w14 w15 w16se w16cid w16 w16cex w16sdtdh w16sdtfl w16du wp14">
   <w:body>
     <w:p>
+      <w:r>
+        <w:rPr>
+          <w:b/>
+          <w:bCs/>
+          <w:sz w:val="48"/>
+          <w:szCs w:val="48"/>
+        </w:rPr>
+        <w:t>Electronic Press Kit</w:t>
+      </w:r>
+    </w:p>
+    <w:p>
+      <w:r>
+        <w:t xml:space="preserve">A5 - PHP - MVC </w:t>
+      </w:r>
+      <w:proofErr w:type="spellStart"/>
+      <w:r>
+        <w:t>en</w:t>
+      </w:r>
+      <w:proofErr w:type="spellEnd"/>
+      <w:r>
+        <w:t xml:space="preserve"> Testen</w:t>
+      </w:r>
+    </w:p>
+    <w:p>
+      <w:pPr>
+        <w:rPr>
+          <w:color w:val="000000" w:themeColor="text1"/>
+        </w:rPr>
+      </w:pPr>
+      <w:r>
+        <w:rPr>
+          <w:color w:val="000000" w:themeColor="text1"/>
+        </w:rPr>
+        <w:t xml:space="preserve">Lars Kok </w:t>
+      </w:r>
+    </w:p>
+    <w:p>
+      <w:pPr>
+        <w:rPr>
+          <w:color w:val="000000" w:themeColor="text1"/>
+        </w:rPr>
+      </w:pPr>
+      <w:r>
+        <w:rPr>
+          <w:color w:val="000000" w:themeColor="text1"/>
+        </w:rPr>
+        <w:t>9 Juni 2026</w:t>
+      </w:r>
+    </w:p>
+    <w:p/>
+    <w:p>
+      <w:pPr>
+        <w:pStyle w:val="Heading1"/>
+      </w:pPr>
+      <w:proofErr w:type="spellStart"/>
+      <w:r>
+        <w:t>Functioneel</w:t>
+      </w:r>
+      <w:proofErr w:type="spellEnd"/>
+      <w:r>
+        <w:t xml:space="preserve"> </w:t>
+      </w:r>
+      <w:proofErr w:type="spellStart"/>
+      <w:r>
+        <w:t>Ontwerp</w:t>
+      </w:r>
+      <w:proofErr w:type="spellEnd"/>
+      <w:r>
+        <w:t xml:space="preserve"> (FO)</w:t>
+      </w:r>
+    </w:p>
+    <w:p>
+      <w:pPr>
+        <w:pStyle w:val="Heading2"/>
+      </w:pPr>
+      <w:r>
+        <w:t xml:space="preserve">Wat is de </w:t>
+      </w:r>
+      <w:proofErr w:type="spellStart"/>
+      <w:r>
+        <w:t>applicatie</w:t>
+      </w:r>
+      <w:proofErr w:type="spellEnd"/>
+      <w:r>
+        <w:t>?</w:t>
+      </w:r>
+    </w:p>
+    <w:p>
+      <w:pPr>
+        <w:rPr>
+          <w:color w:val="000000" w:themeColor="text1"/>
+        </w:rPr>
+      </w:pPr>
+      <w:r>
+        <w:rPr>
+          <w:color w:val="000000" w:themeColor="text1"/>
+        </w:rPr>
+        <w:t>Met d</w:t>
+      </w:r>
+      <w:r>
+        <w:rPr>
+          <w:color w:val="000000" w:themeColor="text1"/>
+        </w:rPr>
+        <w:t xml:space="preserve">e EPK website </w:t>
+      </w:r>
+      <w:r>
+        <w:rPr>
+          <w:color w:val="000000" w:themeColor="text1"/>
+        </w:rPr>
+        <w:t xml:space="preserve">is het </w:t>
+      </w:r>
+      <w:proofErr w:type="spellStart"/>
+      <w:r>
+        <w:rPr>
+          <w:color w:val="000000" w:themeColor="text1"/>
+        </w:rPr>
+        <w:t>mogelijk</w:t>
+      </w:r>
+      <w:proofErr w:type="spellEnd"/>
+      <w:r>
+        <w:rPr>
+          <w:color w:val="000000" w:themeColor="text1"/>
+        </w:rPr>
+        <w:t xml:space="preserve"> om band / artiest </w:t>
+      </w:r>
+      <w:proofErr w:type="spellStart"/>
+      <w:r>
+        <w:rPr>
+          <w:color w:val="000000" w:themeColor="text1"/>
+        </w:rPr>
+        <w:t>profielen</w:t>
+      </w:r>
+      <w:proofErr w:type="spellEnd"/>
+      <w:r>
+        <w:rPr>
+          <w:color w:val="000000" w:themeColor="text1"/>
+        </w:rPr>
+        <w:t xml:space="preserve"> </w:t>
+      </w:r>
+      <w:proofErr w:type="spellStart"/>
+      <w:r>
+        <w:rPr>
+          <w:color w:val="000000" w:themeColor="text1"/>
+        </w:rPr>
+        <w:t>aan</w:t>
+      </w:r>
+      <w:proofErr w:type="spellEnd"/>
+      <w:r>
+        <w:rPr>
+          <w:color w:val="000000" w:themeColor="text1"/>
+        </w:rPr>
+        <w:t xml:space="preserve"> </w:t>
+      </w:r>
+      <w:proofErr w:type="spellStart"/>
+      <w:r>
+        <w:rPr>
+          <w:color w:val="000000" w:themeColor="text1"/>
+        </w:rPr>
+        <w:t>te</w:t>
+      </w:r>
+      <w:proofErr w:type="spellEnd"/>
+      <w:r>
+        <w:rPr>
+          <w:color w:val="000000" w:themeColor="text1"/>
+        </w:rPr>
+        <w:t xml:space="preserve"> </w:t>
+      </w:r>
+      <w:proofErr w:type="spellStart"/>
+      <w:r>
+        <w:rPr>
+          <w:color w:val="000000" w:themeColor="text1"/>
+        </w:rPr>
+        <w:t>maken</w:t>
+      </w:r>
+      <w:proofErr w:type="spellEnd"/>
+      <w:r>
+        <w:rPr>
+          <w:color w:val="000000" w:themeColor="text1"/>
+        </w:rPr>
+        <w:t xml:space="preserve"> die </w:t>
+      </w:r>
+      <w:proofErr w:type="spellStart"/>
+      <w:r>
+        <w:rPr>
+          <w:color w:val="000000" w:themeColor="text1"/>
+        </w:rPr>
+        <w:t>ge</w:t>
+      </w:r>
+      <w:r>
+        <w:rPr>
+          <w:color w:val="000000" w:themeColor="text1"/>
+        </w:rPr>
+        <w:t>dee</w:t>
+      </w:r>
+      <w:r>
+        <w:rPr>
+          <w:color w:val="000000" w:themeColor="text1"/>
+        </w:rPr>
+        <w:t>ld</w:t>
+      </w:r>
+      <w:proofErr w:type="spellEnd"/>
+      <w:r>
+        <w:rPr>
+          <w:color w:val="000000" w:themeColor="text1"/>
+        </w:rPr>
+        <w:t xml:space="preserve"> </w:t>
+      </w:r>
+      <w:proofErr w:type="spellStart"/>
+      <w:r>
+        <w:rPr>
+          <w:color w:val="000000" w:themeColor="text1"/>
+        </w:rPr>
+        <w:t>kan</w:t>
+      </w:r>
+      <w:proofErr w:type="spellEnd"/>
+      <w:r>
+        <w:rPr>
+          <w:color w:val="000000" w:themeColor="text1"/>
+        </w:rPr>
+        <w:t xml:space="preserve"> </w:t>
+      </w:r>
+      <w:proofErr w:type="spellStart"/>
+      <w:r>
+        <w:rPr>
+          <w:color w:val="000000" w:themeColor="text1"/>
+        </w:rPr>
+        <w:t>worden</w:t>
+      </w:r>
+      <w:proofErr w:type="spellEnd"/>
+      <w:r>
+        <w:rPr>
+          <w:color w:val="000000" w:themeColor="text1"/>
+        </w:rPr>
+        <w:t xml:space="preserve"> </w:t>
+      </w:r>
+      <w:r>
+        <w:rPr>
+          <w:color w:val="000000" w:themeColor="text1"/>
+        </w:rPr>
+        <w:t xml:space="preserve">met </w:t>
+      </w:r>
+      <w:proofErr w:type="spellStart"/>
+      <w:r>
+        <w:rPr>
+          <w:color w:val="000000" w:themeColor="text1"/>
+        </w:rPr>
+        <w:t>andere</w:t>
+      </w:r>
+      <w:proofErr w:type="spellEnd"/>
+      <w:r>
+        <w:rPr>
+          <w:color w:val="000000" w:themeColor="text1"/>
+        </w:rPr>
+        <w:t xml:space="preserve"> </w:t>
+      </w:r>
+      <w:proofErr w:type="spellStart"/>
+      <w:r>
+        <w:rPr>
+          <w:color w:val="000000" w:themeColor="text1"/>
+        </w:rPr>
+        <w:t>mensen</w:t>
+      </w:r>
+      <w:proofErr w:type="spellEnd"/>
+      <w:r>
+        <w:rPr>
+          <w:color w:val="000000" w:themeColor="text1"/>
+        </w:rPr>
+        <w:t xml:space="preserve">. </w:t>
+      </w:r>
+    </w:p>
+    <w:p/>
+    <w:p>
+      <w:pPr>
+        <w:pStyle w:val="Heading2"/>
+      </w:pPr>
+      <w:r>
+        <w:t xml:space="preserve">Voor </w:t>
+      </w:r>
+      <w:proofErr w:type="spellStart"/>
+      <w:r>
+        <w:t>wie</w:t>
+      </w:r>
+      <w:proofErr w:type="spellEnd"/>
+      <w:r>
+        <w:t xml:space="preserve"> is het?</w:t>
+      </w:r>
+    </w:p>
+    <w:p>
+      <w:pPr>
+        <w:pStyle w:val="ListParagraph"/>
+        <w:numPr>
+          <w:ilvl w:val="0"/>
+          <w:numId w:val="1"/>
+        </w:numPr>
+        <w:contextualSpacing w:val="0"/>
+      </w:pPr>
+      <w:r>
+        <w:t xml:space="preserve">Bands </w:t>
+      </w:r>
+      <w:proofErr w:type="spellStart"/>
+      <w:r>
+        <w:t>en</w:t>
+      </w:r>
+      <w:proofErr w:type="spellEnd"/>
+      <w:r>
+        <w:t xml:space="preserve"> </w:t>
+      </w:r>
+      <w:proofErr w:type="spellStart"/>
+      <w:r>
+        <w:t>artiesten</w:t>
+      </w:r>
+      <w:proofErr w:type="spellEnd"/>
+    </w:p>
+    <w:p>
+      <w:pPr>
+        <w:pStyle w:val="ListParagraph"/>
+        <w:numPr>
+          <w:ilvl w:val="0"/>
+          <w:numId w:val="1"/>
+        </w:numPr>
+        <w:contextualSpacing w:val="0"/>
+      </w:pPr>
+      <w:proofErr w:type="spellStart"/>
+      <w:r>
+        <w:t>Bedrijven</w:t>
+      </w:r>
+      <w:proofErr w:type="spellEnd"/>
+      <w:r>
+        <w:t xml:space="preserve"> </w:t>
+      </w:r>
+      <w:proofErr w:type="spellStart"/>
+      <w:r>
+        <w:t>en</w:t>
+      </w:r>
+      <w:proofErr w:type="spellEnd"/>
+      <w:r>
+        <w:t xml:space="preserve"> media</w:t>
+      </w:r>
+    </w:p>
+    <w:p>
+      <w:pPr>
+        <w:pStyle w:val="ListParagraph"/>
+        <w:numPr>
+          <w:ilvl w:val="0"/>
+          <w:numId w:val="1"/>
+        </w:numPr>
+        <w:contextualSpacing w:val="0"/>
+      </w:pPr>
+      <w:r>
+        <w:t xml:space="preserve">Mensen die bands </w:t>
+      </w:r>
+      <w:proofErr w:type="spellStart"/>
+      <w:r>
+        <w:t>zoeken</w:t>
+      </w:r>
+      <w:proofErr w:type="spellEnd"/>
+    </w:p>
+    <w:p/>
+    <w:p>
+      <w:pPr>
+        <w:pStyle w:val="Heading2"/>
+      </w:pPr>
+      <w:r>
+        <w:t>Use Cases</w:t>
+      </w:r>
+    </w:p>
+    <w:p>
+      <w:r>
+        <w:t xml:space="preserve">UC-01: Band </w:t>
+      </w:r>
+      <w:proofErr w:type="spellStart"/>
+      <w:r>
+        <w:t>zoeken</w:t>
+      </w:r>
+      <w:proofErr w:type="spellEnd"/>
+    </w:p>
+    <w:p>
+      <w:pPr>
+        <w:pStyle w:val="ListParagraph"/>
+        <w:numPr>
+          <w:ilvl w:val="0"/>
+          <w:numId w:val="1"/>
+        </w:numPr>
+        <w:contextualSpacing w:val="0"/>
+      </w:pPr>
+      <w:r>
+        <w:t xml:space="preserve">Gebruiker </w:t>
+      </w:r>
+      <w:proofErr w:type="spellStart"/>
+      <w:r>
+        <w:t>zoekt</w:t>
+      </w:r>
+      <w:proofErr w:type="spellEnd"/>
+      <w:r>
+        <w:t xml:space="preserve"> op </w:t>
+      </w:r>
+      <w:proofErr w:type="spellStart"/>
+      <w:r>
+        <w:t>bandnaam</w:t>
+      </w:r>
+      <w:proofErr w:type="spellEnd"/>
+      <w:r>
+        <w:t xml:space="preserve"> op de </w:t>
+      </w:r>
+      <w:proofErr w:type="spellStart"/>
+      <w:r>
+        <w:t>homepagina</w:t>
+      </w:r>
+      <w:proofErr w:type="spellEnd"/>
+    </w:p>
+    <w:p>
+      <w:pPr>
+        <w:pStyle w:val="ListParagraph"/>
+        <w:numPr>
+          <w:ilvl w:val="0"/>
+          <w:numId w:val="1"/>
+        </w:numPr>
+        <w:contextualSpacing w:val="0"/>
+      </w:pPr>
+      <w:proofErr w:type="spellStart"/>
+      <w:r>
+        <w:t>Krijgt</w:t>
+      </w:r>
+      <w:proofErr w:type="spellEnd"/>
+      <w:r>
+        <w:t xml:space="preserve"> </w:t>
+      </w:r>
+      <w:proofErr w:type="spellStart"/>
+      <w:r>
+        <w:t>een</w:t>
+      </w:r>
+      <w:proofErr w:type="spellEnd"/>
+      <w:r>
+        <w:t xml:space="preserve"> </w:t>
+      </w:r>
+      <w:proofErr w:type="spellStart"/>
+      <w:r>
+        <w:t>lijst</w:t>
+      </w:r>
+      <w:proofErr w:type="spellEnd"/>
+      <w:r>
+        <w:t xml:space="preserve"> met </w:t>
+      </w:r>
+      <w:proofErr w:type="spellStart"/>
+      <w:r>
+        <w:t>foto</w:t>
+      </w:r>
+      <w:proofErr w:type="spellEnd"/>
+      <w:r>
+        <w:t xml:space="preserve">, naam </w:t>
+      </w:r>
+      <w:proofErr w:type="spellStart"/>
+      <w:r>
+        <w:t>en</w:t>
+      </w:r>
+      <w:proofErr w:type="spellEnd"/>
+      <w:r>
+        <w:t xml:space="preserve"> </w:t>
+      </w:r>
+      <w:proofErr w:type="spellStart"/>
+      <w:r>
+        <w:t>beschrijving</w:t>
+      </w:r>
+      <w:proofErr w:type="spellEnd"/>
+    </w:p>
+    <w:p>
+      <w:pPr>
+        <w:pStyle w:val="ListParagraph"/>
+        <w:numPr>
+          <w:ilvl w:val="0"/>
+          <w:numId w:val="1"/>
+        </w:numPr>
+        <w:contextualSpacing w:val="0"/>
+      </w:pPr>
+      <w:proofErr w:type="spellStart"/>
+      <w:r>
+        <w:t>Klikt</w:t>
+      </w:r>
+      <w:proofErr w:type="spellEnd"/>
+      <w:r>
+        <w:t xml:space="preserve"> door </w:t>
+      </w:r>
+      <w:proofErr w:type="spellStart"/>
+      <w:r>
+        <w:t>naar</w:t>
+      </w:r>
+      <w:proofErr w:type="spellEnd"/>
+      <w:r>
+        <w:t xml:space="preserve"> de EPK </w:t>
+      </w:r>
+      <w:proofErr w:type="spellStart"/>
+      <w:r>
+        <w:t>pagina</w:t>
+      </w:r>
+      <w:proofErr w:type="spellEnd"/>
+      <w:r>
+        <w:t xml:space="preserve"> van </w:t>
+      </w:r>
+      <w:proofErr w:type="spellStart"/>
+      <w:r>
+        <w:t>een</w:t>
+      </w:r>
+      <w:proofErr w:type="spellEnd"/>
+      <w:r>
+        <w:t xml:space="preserve"> band</w:t>
+      </w:r>
+    </w:p>
+    <w:p/>
+    <w:p>
+      <w:r>
+        <w:t xml:space="preserve">UC-02: </w:t>
+      </w:r>
+      <w:proofErr w:type="spellStart"/>
+      <w:r>
+        <w:t>Registreren</w:t>
+      </w:r>
+      <w:proofErr w:type="spellEnd"/>
+    </w:p>
+    <w:p>
+      <w:pPr>
+        <w:pStyle w:val="ListParagraph"/>
+        <w:numPr>
+          <w:ilvl w:val="0"/>
+          <w:numId w:val="1"/>
+        </w:numPr>
+        <w:contextualSpacing w:val="0"/>
+      </w:pPr>
+      <w:r>
+        <w:t xml:space="preserve">Gebruiker </w:t>
+      </w:r>
+      <w:proofErr w:type="spellStart"/>
+      <w:r>
+        <w:t>maakt</w:t>
+      </w:r>
+      <w:proofErr w:type="spellEnd"/>
+      <w:r>
+        <w:t xml:space="preserve"> </w:t>
+      </w:r>
+      <w:proofErr w:type="spellStart"/>
+      <w:r>
+        <w:t>een</w:t>
+      </w:r>
+      <w:proofErr w:type="spellEnd"/>
+      <w:r>
+        <w:t xml:space="preserve"> account </w:t>
+      </w:r>
+      <w:proofErr w:type="spellStart"/>
+      <w:r>
+        <w:t>aan</w:t>
+      </w:r>
+      <w:proofErr w:type="spellEnd"/>
+      <w:r>
+        <w:t xml:space="preserve"> email </w:t>
+      </w:r>
+      <w:proofErr w:type="spellStart"/>
+      <w:r>
+        <w:t>en</w:t>
+      </w:r>
+      <w:proofErr w:type="spellEnd"/>
+      <w:r>
+        <w:t xml:space="preserve"> </w:t>
+      </w:r>
+      <w:proofErr w:type="spellStart"/>
+      <w:r>
+        <w:t>wachtwoord</w:t>
+      </w:r>
+      <w:proofErr w:type="spellEnd"/>
+    </w:p>
+    <w:p>
+      <w:pPr>
+        <w:pStyle w:val="ListParagraph"/>
+        <w:numPr>
+          <w:ilvl w:val="0"/>
+          <w:numId w:val="1"/>
+        </w:numPr>
+        <w:contextualSpacing w:val="0"/>
+      </w:pPr>
+      <w:proofErr w:type="spellStart"/>
+      <w:r>
+        <w:t>Wordt</w:t>
+      </w:r>
+      <w:proofErr w:type="spellEnd"/>
+      <w:r>
+        <w:t xml:space="preserve"> </w:t>
+      </w:r>
+      <w:proofErr w:type="spellStart"/>
+      <w:r>
+        <w:t>doorgestuurd</w:t>
+      </w:r>
+      <w:proofErr w:type="spellEnd"/>
+      <w:r>
+        <w:t xml:space="preserve"> </w:t>
+      </w:r>
+      <w:proofErr w:type="spellStart"/>
+      <w:r>
+        <w:t>naar</w:t>
+      </w:r>
+      <w:proofErr w:type="spellEnd"/>
+      <w:r>
+        <w:t xml:space="preserve"> het dashboard</w:t>
+      </w:r>
+    </w:p>
+    <w:p/>
+    <w:p>
+      <w:r>
+        <w:t xml:space="preserve">UC-03: </w:t>
+      </w:r>
+      <w:proofErr w:type="spellStart"/>
+      <w:r>
+        <w:t>Inloggen</w:t>
+      </w:r>
+      <w:proofErr w:type="spellEnd"/>
+    </w:p>
+    <w:p>
+      <w:pPr>
+        <w:pStyle w:val="ListParagraph"/>
+        <w:numPr>
+          <w:ilvl w:val="0"/>
+          <w:numId w:val="1"/>
+        </w:numPr>
+        <w:contextualSpacing w:val="0"/>
+      </w:pPr>
+      <w:r>
+        <w:t xml:space="preserve">Gebruiker </w:t>
+      </w:r>
+      <w:proofErr w:type="spellStart"/>
+      <w:r>
+        <w:t>logt</w:t>
+      </w:r>
+      <w:proofErr w:type="spellEnd"/>
+      <w:r>
+        <w:t xml:space="preserve"> in met email </w:t>
+      </w:r>
+      <w:proofErr w:type="spellStart"/>
+      <w:r>
+        <w:t>en</w:t>
+      </w:r>
+      <w:proofErr w:type="spellEnd"/>
+      <w:r>
+        <w:t xml:space="preserve"> </w:t>
+      </w:r>
+      <w:proofErr w:type="spellStart"/>
+      <w:r>
+        <w:t>wachtwoord</w:t>
+      </w:r>
+      <w:proofErr w:type="spellEnd"/>
+    </w:p>
+    <w:p>
+      <w:pPr>
+        <w:pStyle w:val="ListParagraph"/>
+        <w:numPr>
+          <w:ilvl w:val="0"/>
+          <w:numId w:val="1"/>
+        </w:numPr>
+        <w:contextualSpacing w:val="0"/>
+      </w:pPr>
+      <w:proofErr w:type="spellStart"/>
+      <w:r>
+        <w:t>Wordt</w:t>
+      </w:r>
+      <w:proofErr w:type="spellEnd"/>
+      <w:r>
+        <w:t xml:space="preserve"> </w:t>
+      </w:r>
+      <w:proofErr w:type="spellStart"/>
+      <w:r>
+        <w:t>ook</w:t>
+      </w:r>
+      <w:proofErr w:type="spellEnd"/>
+      <w:r>
+        <w:t xml:space="preserve"> </w:t>
+      </w:r>
+      <w:proofErr w:type="spellStart"/>
+      <w:r>
+        <w:t>doorgestuurd</w:t>
+      </w:r>
+      <w:proofErr w:type="spellEnd"/>
+      <w:r>
+        <w:t xml:space="preserve"> </w:t>
+      </w:r>
+      <w:proofErr w:type="spellStart"/>
+      <w:r>
+        <w:t>naar</w:t>
+      </w:r>
+      <w:proofErr w:type="spellEnd"/>
+      <w:r>
+        <w:t xml:space="preserve"> het dashboard</w:t>
+      </w:r>
+    </w:p>
+    <w:p/>
+    <w:p>
+      <w:r>
+        <w:t xml:space="preserve">UC-04: Band </w:t>
+      </w:r>
+      <w:proofErr w:type="spellStart"/>
+      <w:r>
+        <w:t>aanmaken</w:t>
+      </w:r>
+      <w:proofErr w:type="spellEnd"/>
+    </w:p>
+    <w:p>
+      <w:pPr>
+        <w:pStyle w:val="ListParagraph"/>
+        <w:numPr>
+          <w:ilvl w:val="0"/>
+          <w:numId w:val="1"/>
+        </w:numPr>
+        <w:contextualSpacing w:val="0"/>
+      </w:pPr>
+      <w:proofErr w:type="spellStart"/>
+      <w:r>
+        <w:t>Ingelogde</w:t>
+      </w:r>
+      <w:proofErr w:type="spellEnd"/>
+      <w:r>
+        <w:t xml:space="preserve"> </w:t>
+      </w:r>
+      <w:proofErr w:type="spellStart"/>
+      <w:r>
+        <w:t>gebruiker</w:t>
+      </w:r>
+      <w:proofErr w:type="spellEnd"/>
+      <w:r>
+        <w:t xml:space="preserve"> </w:t>
+      </w:r>
+      <w:proofErr w:type="spellStart"/>
+      <w:r>
+        <w:t>maakt</w:t>
+      </w:r>
+      <w:proofErr w:type="spellEnd"/>
+      <w:r>
+        <w:t xml:space="preserve"> </w:t>
+      </w:r>
+      <w:proofErr w:type="spellStart"/>
+      <w:r>
+        <w:t>een</w:t>
+      </w:r>
+      <w:proofErr w:type="spellEnd"/>
+      <w:r>
+        <w:t xml:space="preserve"> </w:t>
+      </w:r>
+      <w:proofErr w:type="spellStart"/>
+      <w:r>
+        <w:t>nieuwe</w:t>
+      </w:r>
+      <w:proofErr w:type="spellEnd"/>
+      <w:r>
+        <w:t xml:space="preserve"> band </w:t>
+      </w:r>
+      <w:proofErr w:type="spellStart"/>
+      <w:r>
+        <w:t>aan</w:t>
+      </w:r>
+      <w:proofErr w:type="spellEnd"/>
+    </w:p>
+    <w:p>
+      <w:pPr>
+        <w:pStyle w:val="ListParagraph"/>
+        <w:numPr>
+          <w:ilvl w:val="0"/>
+          <w:numId w:val="1"/>
+        </w:numPr>
+        <w:contextualSpacing w:val="0"/>
+      </w:pPr>
+      <w:proofErr w:type="spellStart"/>
+      <w:r>
+        <w:t>Vult</w:t>
+      </w:r>
+      <w:proofErr w:type="spellEnd"/>
+      <w:r>
+        <w:t xml:space="preserve"> naam </w:t>
+      </w:r>
+      <w:proofErr w:type="spellStart"/>
+      <w:r>
+        <w:t>en</w:t>
+      </w:r>
+      <w:proofErr w:type="spellEnd"/>
+      <w:r>
+        <w:t xml:space="preserve"> genre in</w:t>
+      </w:r>
+    </w:p>
+    <w:p>
+      <w:pPr>
+        <w:pStyle w:val="ListParagraph"/>
+        <w:numPr>
+          <w:ilvl w:val="0"/>
+          <w:numId w:val="1"/>
+        </w:numPr>
+        <w:contextualSpacing w:val="0"/>
+      </w:pPr>
+      <w:r>
+        <w:t xml:space="preserve">Kan </w:t>
+      </w:r>
+      <w:proofErr w:type="spellStart"/>
+      <w:r>
+        <w:t>beschrijving</w:t>
+      </w:r>
+      <w:proofErr w:type="spellEnd"/>
+      <w:r>
+        <w:t xml:space="preserve">, </w:t>
+      </w:r>
+      <w:proofErr w:type="spellStart"/>
+      <w:r>
+        <w:t>foto</w:t>
+      </w:r>
+      <w:proofErr w:type="spellEnd"/>
+      <w:r>
+        <w:t xml:space="preserve">, </w:t>
+      </w:r>
+      <w:proofErr w:type="spellStart"/>
+      <w:r>
+        <w:t>biografie</w:t>
+      </w:r>
+      <w:proofErr w:type="spellEnd"/>
+      <w:r>
+        <w:t xml:space="preserve">, YouTube videos </w:t>
+      </w:r>
+      <w:proofErr w:type="spellStart"/>
+      <w:r>
+        <w:t>en</w:t>
+      </w:r>
+      <w:proofErr w:type="spellEnd"/>
+      <w:r>
+        <w:t xml:space="preserve"> </w:t>
+      </w:r>
+      <w:proofErr w:type="spellStart"/>
+      <w:r>
+        <w:t>kleuren</w:t>
+      </w:r>
+      <w:proofErr w:type="spellEnd"/>
+      <w:r>
+        <w:t xml:space="preserve"> </w:t>
+      </w:r>
+      <w:proofErr w:type="spellStart"/>
+      <w:r>
+        <w:t>toevoegen</w:t>
+      </w:r>
+      <w:proofErr w:type="spellEnd"/>
+    </w:p>
+    <w:p/>
+    <w:p>
+      <w:r>
+        <w:t xml:space="preserve">UC-05: Band </w:t>
+      </w:r>
+      <w:proofErr w:type="spellStart"/>
+      <w:r>
+        <w:t>bewerken</w:t>
+      </w:r>
+      <w:proofErr w:type="spellEnd"/>
+    </w:p>
+    <w:p>
+      <w:pPr>
+        <w:pStyle w:val="ListParagraph"/>
+        <w:numPr>
+          <w:ilvl w:val="0"/>
+          <w:numId w:val="1"/>
+        </w:numPr>
+        <w:contextualSpacing w:val="0"/>
+      </w:pPr>
+      <w:proofErr w:type="spellStart"/>
+      <w:r>
+        <w:t>Ingelogde</w:t>
+      </w:r>
+      <w:proofErr w:type="spellEnd"/>
+      <w:r>
+        <w:t xml:space="preserve"> </w:t>
+      </w:r>
+      <w:proofErr w:type="spellStart"/>
+      <w:r>
+        <w:t>gebruiker</w:t>
+      </w:r>
+      <w:proofErr w:type="spellEnd"/>
+      <w:r>
+        <w:t xml:space="preserve"> past band </w:t>
+      </w:r>
+      <w:proofErr w:type="spellStart"/>
+      <w:r>
+        <w:t>informatie</w:t>
+      </w:r>
+      <w:proofErr w:type="spellEnd"/>
+      <w:r>
+        <w:t xml:space="preserve"> </w:t>
+      </w:r>
+      <w:proofErr w:type="spellStart"/>
+      <w:r>
+        <w:t>aan</w:t>
+      </w:r>
+      <w:proofErr w:type="spellEnd"/>
+    </w:p>
+    <w:p>
+      <w:pPr>
+        <w:pStyle w:val="ListParagraph"/>
+        <w:numPr>
+          <w:ilvl w:val="0"/>
+          <w:numId w:val="1"/>
+        </w:numPr>
+        <w:contextualSpacing w:val="0"/>
+      </w:pPr>
+      <w:r>
+        <w:t xml:space="preserve">Kan </w:t>
+      </w:r>
+      <w:proofErr w:type="spellStart"/>
+      <w:r>
+        <w:t>foto</w:t>
+      </w:r>
+      <w:proofErr w:type="spellEnd"/>
+      <w:r>
+        <w:t xml:space="preserve"> </w:t>
+      </w:r>
+      <w:proofErr w:type="spellStart"/>
+      <w:r>
+        <w:t>verwijderen</w:t>
+      </w:r>
+      <w:proofErr w:type="spellEnd"/>
+      <w:r>
+        <w:t xml:space="preserve"> of </w:t>
+      </w:r>
+      <w:proofErr w:type="spellStart"/>
+      <w:r>
+        <w:t>vervangen</w:t>
+      </w:r>
+      <w:proofErr w:type="spellEnd"/>
+    </w:p>
+    <w:p>
+      <w:pPr>
+        <w:pStyle w:val="ListParagraph"/>
+        <w:numPr>
+          <w:ilvl w:val="0"/>
+          <w:numId w:val="1"/>
+        </w:numPr>
+        <w:contextualSpacing w:val="0"/>
+      </w:pPr>
+      <w:r>
+        <w:t xml:space="preserve">Kan videos </w:t>
+      </w:r>
+      <w:proofErr w:type="spellStart"/>
+      <w:r>
+        <w:t>aanpassen</w:t>
+      </w:r>
+      <w:proofErr w:type="spellEnd"/>
+      <w:r>
+        <w:t xml:space="preserve"> of </w:t>
+      </w:r>
+      <w:proofErr w:type="spellStart"/>
+      <w:r>
+        <w:t>wissen</w:t>
+      </w:r>
+      <w:proofErr w:type="spellEnd"/>
+    </w:p>
+    <w:p/>
+    <w:p>
+      <w:r>
+        <w:t xml:space="preserve">UC-06: Gebruiker </w:t>
+      </w:r>
+      <w:proofErr w:type="spellStart"/>
+      <w:r>
+        <w:t>toevoegen</w:t>
+      </w:r>
+      <w:proofErr w:type="spellEnd"/>
+      <w:r>
+        <w:t xml:space="preserve"> </w:t>
+      </w:r>
+      <w:proofErr w:type="spellStart"/>
+      <w:r>
+        <w:t>aan</w:t>
+      </w:r>
+      <w:proofErr w:type="spellEnd"/>
+      <w:r>
+        <w:t xml:space="preserve"> band</w:t>
+      </w:r>
+    </w:p>
+    <w:p>
+      <w:pPr>
+        <w:pStyle w:val="ListParagraph"/>
+        <w:numPr>
+          <w:ilvl w:val="0"/>
+          <w:numId w:val="1"/>
+        </w:numPr>
+        <w:contextualSpacing w:val="0"/>
+      </w:pPr>
+      <w:r>
+        <w:t xml:space="preserve">Gebruiker </w:t>
+      </w:r>
+      <w:proofErr w:type="spellStart"/>
+      <w:r>
+        <w:t>voegt</w:t>
+      </w:r>
+      <w:proofErr w:type="spellEnd"/>
+      <w:r>
+        <w:t xml:space="preserve"> </w:t>
+      </w:r>
+      <w:proofErr w:type="spellStart"/>
+      <w:r>
+        <w:t>een</w:t>
+      </w:r>
+      <w:proofErr w:type="spellEnd"/>
+      <w:r>
+        <w:t xml:space="preserve"> </w:t>
+      </w:r>
+      <w:proofErr w:type="spellStart"/>
+      <w:r>
+        <w:t>andere</w:t>
+      </w:r>
+      <w:proofErr w:type="spellEnd"/>
+      <w:r>
+        <w:t xml:space="preserve"> </w:t>
+      </w:r>
+      <w:proofErr w:type="spellStart"/>
+      <w:r>
+        <w:t>gebruiker</w:t>
+      </w:r>
+      <w:proofErr w:type="spellEnd"/>
+      <w:r>
+        <w:t xml:space="preserve"> toe via </w:t>
+      </w:r>
+      <w:proofErr w:type="spellStart"/>
+      <w:r>
+        <w:t>emailadres</w:t>
+      </w:r>
+      <w:proofErr w:type="spellEnd"/>
+    </w:p>
+    <w:p>
+      <w:pPr>
+        <w:pStyle w:val="ListParagraph"/>
+        <w:numPr>
+          <w:ilvl w:val="0"/>
+          <w:numId w:val="1"/>
+        </w:numPr>
+        <w:contextualSpacing w:val="0"/>
+      </w:pPr>
+      <w:r>
+        <w:t xml:space="preserve">Die </w:t>
+      </w:r>
+      <w:proofErr w:type="spellStart"/>
+      <w:r>
+        <w:t>gebruiker</w:t>
+      </w:r>
+      <w:proofErr w:type="spellEnd"/>
+      <w:r>
+        <w:t xml:space="preserve"> </w:t>
+      </w:r>
+      <w:proofErr w:type="spellStart"/>
+      <w:r>
+        <w:t>ziet</w:t>
+      </w:r>
+      <w:proofErr w:type="spellEnd"/>
+      <w:r>
+        <w:t xml:space="preserve"> de band </w:t>
+      </w:r>
+      <w:proofErr w:type="spellStart"/>
+      <w:r>
+        <w:t>ook</w:t>
+      </w:r>
+      <w:proofErr w:type="spellEnd"/>
+      <w:r>
+        <w:t xml:space="preserve"> op </w:t>
+      </w:r>
+      <w:proofErr w:type="spellStart"/>
+      <w:r>
+        <w:t>zijn</w:t>
+      </w:r>
+      <w:proofErr w:type="spellEnd"/>
+      <w:r>
+        <w:t xml:space="preserve"> dashboard</w:t>
+      </w:r>
+    </w:p>
+    <w:p/>
+    <w:p>
+      <w:r>
+        <w:rPr>
+          <w:color w:val="CC0000"/>
+        </w:rPr>
+        <w:lastRenderedPageBreak/>
+        <w:t xml:space="preserve">TODO: </w:t>
+      </w:r>
+      <w:proofErr w:type="spellStart"/>
+      <w:r>
+        <w:rPr>
+          <w:color w:val="CC0000"/>
+        </w:rPr>
+        <w:t>Voeg</w:t>
+      </w:r>
+      <w:proofErr w:type="spellEnd"/>
+      <w:r>
+        <w:rPr>
+          <w:color w:val="CC0000"/>
+        </w:rPr>
+        <w:t xml:space="preserve"> </w:t>
+      </w:r>
+      <w:proofErr w:type="spellStart"/>
+      <w:r>
+        <w:rPr>
+          <w:color w:val="CC0000"/>
+        </w:rPr>
+        <w:t>hier</w:t>
+      </w:r>
+      <w:proofErr w:type="spellEnd"/>
+      <w:r>
+        <w:rPr>
+          <w:color w:val="CC0000"/>
+        </w:rPr>
+        <w:t xml:space="preserve"> </w:t>
+      </w:r>
+      <w:proofErr w:type="spellStart"/>
+      <w:r>
+        <w:rPr>
+          <w:color w:val="CC0000"/>
+        </w:rPr>
+        <w:t>zelf</w:t>
+      </w:r>
+      <w:proofErr w:type="spellEnd"/>
+      <w:r>
+        <w:rPr>
+          <w:color w:val="CC0000"/>
+        </w:rPr>
+        <w:t xml:space="preserve"> </w:t>
+      </w:r>
+      <w:proofErr w:type="spellStart"/>
+      <w:r>
+        <w:rPr>
+          <w:color w:val="CC0000"/>
+        </w:rPr>
+        <w:t>nog</w:t>
+      </w:r>
+      <w:proofErr w:type="spellEnd"/>
+      <w:r>
+        <w:rPr>
+          <w:color w:val="CC0000"/>
+        </w:rPr>
+        <w:t xml:space="preserve"> use cases toe </w:t>
+      </w:r>
+      <w:proofErr w:type="spellStart"/>
+      <w:r>
+        <w:rPr>
+          <w:color w:val="CC0000"/>
+        </w:rPr>
+        <w:t>als</w:t>
+      </w:r>
+      <w:proofErr w:type="spellEnd"/>
+      <w:r>
+        <w:rPr>
+          <w:color w:val="CC0000"/>
+        </w:rPr>
+        <w:t xml:space="preserve"> je die </w:t>
+      </w:r>
+      <w:proofErr w:type="spellStart"/>
+      <w:r>
+        <w:rPr>
+          <w:color w:val="CC0000"/>
+        </w:rPr>
+        <w:t>hebt</w:t>
+      </w:r>
+      <w:proofErr w:type="spellEnd"/>
+    </w:p>
+    <w:p>
       <w:pPr>
         <w:rPr>
           <w:sz w:val="44"/>
@@ -13,11 +1168,76 @@
     <w:sectPr>
       <w:pgSz w:w="11906" w:h="16838"/>
       <w:pgMar w:top="1440" w:right="1440" w:bottom="1440" w:left="1440" w:header="708" w:footer="708" w:gutter="0"/>
-      <w:cols w:space="708"/>
+      <w:cols w:space="720"/>
       <w:docGrid w:linePitch="360"/>
     </w:sectPr>
   </w:body>
 </w:document>
+</file>
+
+<file path=word/numbering.xml><?xml version="1.0" encoding="utf-8"?>
+<w:numbering xmlns:wpc="http://schemas.microsoft.com/office/word/2010/wordprocessingCanvas" xmlns:cx="http://schemas.microsoft.com/office/drawing/2014/chartex" xmlns:cx1="http://schemas.microsoft.com/office/drawing/2015/9/8/chartex" xmlns:cx2="http://schemas.microsoft.com/office/drawing/2015/10/21/chartex" xmlns:cx3="http://schemas.microsoft.com/office/drawing/2016/5/9/chartex" xmlns:cx4="http://schemas.microsoft.com/office/drawing/2016/5/10/chartex" xmlns:cx5="http://schemas.microsoft.com/office/drawing/2016/5/11/chartex" xmlns:cx6="http://schemas.microsoft.com/office/drawing/2016/5/12/chartex" xmlns:cx7="http://schemas.microsoft.com/office/drawing/2016/5/13/chartex" xmlns:cx8="http://schemas.microsoft.com/office/drawing/2016/5/14/chartex" xmlns:mc="http://schemas.openxmlformats.org/markup-compatibility/2006" xmlns:aink="http://schemas.microsoft.com/office/drawing/2016/ink" xmlns:am3d="http://schemas.microsoft.com/office/drawing/2017/model3d" xmlns:o="urn:schemas-microsoft-com:office:office" xmlns:oel="http://schemas.microsoft.com/office/2019/extlst" xmlns:r="http://schemas.openxmlformats.org/officeDocument/2006/relationships" xmlns:m="http://schemas.openxmlformats.org/officeDocument/2006/math" xmlns:v="urn:schemas-microsoft-com:vml" xmlns:wp14="http://schemas.microsoft.com/office/word/2010/wordprocessingDrawing" xmlns:wp="http://schemas.openxmlformats.org/drawingml/2006/wordprocessingDrawing" xmlns:w10="urn:schemas-microsoft-com:office:word" xmlns:w="http://schemas.openxmlformats.org/wordprocessingml/2006/main" xmlns:w14="http://schemas.microsoft.com/office/word/2010/wordml" xmlns:w15="http://schemas.microsoft.com/office/word/2012/wordml" xmlns:w16cex="http://schemas.microsoft.com/office/word/2018/wordml/cex" xmlns:w16cid="http://schemas.microsoft.com/office/word/2016/wordml/cid" xmlns:w16="http://schemas.microsoft.com/office/word/2018/wordml" xmlns:w16du="http://schemas.microsoft.com/office/word/2023/wordml/word16du" xmlns:w16sdtdh="http://schemas.microsoft.com/office/word/2020/wordml/sdtdatahash" xmlns:w16sdtfl="http://schemas.microsoft.com/office/word/2024/wordml/sdtformatlock" xmlns:w16se="http://schemas.microsoft.com/office/word/2015/wordml/symex" xmlns:wpg="http://schemas.microsoft.com/office/word/2010/wordprocessingGroup" xmlns:wpi="http://schemas.microsoft.com/office/word/2010/wordprocessingInk" xmlns:wne="http://schemas.microsoft.com/office/word/2006/wordml" xmlns:wps="http://schemas.microsoft.com/office/word/2010/wordprocessingShape" mc:Ignorable="w14 w15 w16se w16cid w16 w16cex w16sdtdh w16sdtfl w16du wp14">
+  <w:abstractNum w:abstractNumId="0" w15:restartNumberingAfterBreak="0">
+    <w:nsid w:val="5F7257F5"/>
+    <w:multiLevelType w:val="hybridMultilevel"/>
+    <w:tmpl w:val="22AA5ED0"/>
+    <w:lvl w:ilvl="0" w:tplc="CB6A5D24">
+      <w:start w:val="1"/>
+      <w:numFmt w:val="bullet"/>
+      <w:lvlText w:val="•"/>
+      <w:lvlJc w:val="left"/>
+      <w:pPr>
+        <w:ind w:left="720" w:hanging="360"/>
+      </w:pPr>
+    </w:lvl>
+    <w:lvl w:ilvl="1" w:tplc="B302D6BC">
+      <w:numFmt w:val="decimal"/>
+      <w:lvlText w:val=""/>
+      <w:lvlJc w:val="left"/>
+    </w:lvl>
+    <w:lvl w:ilvl="2" w:tplc="9A60C80A">
+      <w:numFmt w:val="decimal"/>
+      <w:lvlText w:val=""/>
+      <w:lvlJc w:val="left"/>
+    </w:lvl>
+    <w:lvl w:ilvl="3" w:tplc="AC56CC36">
+      <w:numFmt w:val="decimal"/>
+      <w:lvlText w:val=""/>
+      <w:lvlJc w:val="left"/>
+    </w:lvl>
+    <w:lvl w:ilvl="4" w:tplc="B78E547E">
+      <w:numFmt w:val="decimal"/>
+      <w:lvlText w:val=""/>
+      <w:lvlJc w:val="left"/>
+    </w:lvl>
+    <w:lvl w:ilvl="5" w:tplc="EED28A1C">
+      <w:numFmt w:val="decimal"/>
+      <w:lvlText w:val=""/>
+      <w:lvlJc w:val="left"/>
+    </w:lvl>
+    <w:lvl w:ilvl="6" w:tplc="C83409BA">
+      <w:numFmt w:val="decimal"/>
+      <w:lvlText w:val=""/>
+      <w:lvlJc w:val="left"/>
+    </w:lvl>
+    <w:lvl w:ilvl="7" w:tplc="7EDE98F0">
+      <w:numFmt w:val="decimal"/>
+      <w:lvlText w:val=""/>
+      <w:lvlJc w:val="left"/>
+    </w:lvl>
+    <w:lvl w:ilvl="8" w:tplc="A5EE4486">
+      <w:numFmt w:val="decimal"/>
+      <w:lvlText w:val=""/>
+      <w:lvlJc w:val="left"/>
+    </w:lvl>
+  </w:abstractNum>
+  <w:num w:numId="1" w16cid:durableId="1685663762">
+    <w:abstractNumId w:val="0"/>
+    <w:lvlOverride w:ilvl="0">
+      <w:startOverride w:val="1"/>
+    </w:lvlOverride>
+  </w:num>
+</w:numbering>
 </file>
 
 <file path=word/styles.xml><?xml version="1.0" encoding="utf-8"?>
@@ -219,7 +1439,7 @@
     <w:lsdException w:name="Medium Shading 2 Accent 1" w:uiPriority="64"/>
     <w:lsdException w:name="Medium List 1 Accent 1" w:uiPriority="65"/>
     <w:lsdException w:name="Revision" w:semiHidden="1"/>
-    <w:lsdException w:name="List Paragraph" w:uiPriority="34" w:qFormat="1"/>
+    <w:lsdException w:name="List Paragraph" w:uiPriority="0" w:qFormat="1"/>
     <w:lsdException w:name="Quote" w:uiPriority="29" w:qFormat="1"/>
     <w:lsdException w:name="Intense Quote" w:uiPriority="30" w:qFormat="1"/>
     <w:lsdException w:name="Medium List 2 Accent 1" w:uiPriority="66"/>
@@ -420,8 +1640,17 @@
   <w:style w:type="paragraph" w:default="1" w:styleId="Normal">
     <w:name w:val="Normal"/>
     <w:qFormat/>
-    <w:rPr>
-      <w:lang w:val="nl-NL"/>
+    <w:rsid w:val="009749E0"/>
+    <w:pPr>
+      <w:spacing w:after="0" w:line="240" w:lineRule="auto"/>
+    </w:pPr>
+    <w:rPr>
+      <w:rFonts w:ascii="Arial" w:eastAsia="Arial" w:hAnsi="Arial" w:cs="Arial"/>
+      <w:kern w:val="0"/>
+      <w:sz w:val="24"/>
+      <w:szCs w:val="24"/>
+      <w:lang w:val="en-NL"/>
+      <w14:ligatures w14:val="none"/>
     </w:rPr>
   </w:style>
   <w:style w:type="paragraph" w:styleId="Heading1">
@@ -451,7 +1680,6 @@
     <w:next w:val="Normal"/>
     <w:link w:val="Heading2Char"/>
     <w:uiPriority w:val="9"/>
-    <w:semiHidden/>
     <w:unhideWhenUsed/>
     <w:qFormat/>
     <w:rsid w:val="00331640"/>
@@ -548,7 +1776,7 @@
     <w:pPr>
       <w:keepNext/>
       <w:keepLines/>
-      <w:spacing w:before="40" w:after="0"/>
+      <w:spacing w:before="40"/>
       <w:outlineLvl w:val="5"/>
     </w:pPr>
     <w:rPr>
@@ -571,7 +1799,7 @@
     <w:pPr>
       <w:keepNext/>
       <w:keepLines/>
-      <w:spacing w:before="40" w:after="0"/>
+      <w:spacing w:before="40"/>
       <w:outlineLvl w:val="6"/>
     </w:pPr>
     <w:rPr>
@@ -592,7 +1820,6 @@
     <w:pPr>
       <w:keepNext/>
       <w:keepLines/>
-      <w:spacing w:after="0"/>
       <w:outlineLvl w:val="7"/>
     </w:pPr>
     <w:rPr>
@@ -615,7 +1842,6 @@
     <w:pPr>
       <w:keepNext/>
       <w:keepLines/>
-      <w:spacing w:after="0"/>
       <w:outlineLvl w:val="8"/>
     </w:pPr>
     <w:rPr>
@@ -669,7 +1895,6 @@
     <w:basedOn w:val="DefaultParagraphFont"/>
     <w:link w:val="Heading2"/>
     <w:uiPriority w:val="9"/>
-    <w:semiHidden/>
     <w:rsid w:val="00331640"/>
     <w:rPr>
       <w:rFonts w:asciiTheme="majorHAnsi" w:eastAsiaTheme="majorEastAsia" w:hAnsiTheme="majorHAnsi" w:cstheme="majorBidi"/>
@@ -787,7 +2012,7 @@
     <w:qFormat/>
     <w:rsid w:val="00331640"/>
     <w:pPr>
-      <w:spacing w:after="80" w:line="240" w:lineRule="auto"/>
+      <w:spacing w:after="80"/>
       <w:contextualSpacing/>
     </w:pPr>
     <w:rPr>
@@ -883,7 +2108,6 @@
   <w:style w:type="paragraph" w:styleId="ListParagraph">
     <w:name w:val="List Paragraph"/>
     <w:basedOn w:val="Normal"/>
-    <w:uiPriority w:val="34"/>
     <w:qFormat/>
     <w:rsid w:val="00331640"/>
     <w:pPr>

</xml_diff>